<commit_message>
add additions to the notes
</commit_message>
<xml_diff>
--- a/docs/Чтение данных из регистра датчика по I2C с блокирующими циклами while.docx
+++ b/docs/Чтение данных из регистра датчика по I2C с блокирующими циклами while.docx
@@ -3306,13 +3306,7 @@
         <w:rPr>
           <w:lang w:val="en-US"/>
         </w:rPr>
-        <w:t xml:space="preserve"> </w:t>
-      </w:r>
-      <w:r>
-        <w:rPr>
-          <w:lang w:val="en-US"/>
-        </w:rPr>
-        <w:t>-&gt; Restart</w:t>
+        <w:t xml:space="preserve"> -&gt; Restart</w:t>
       </w:r>
       <w:r>
         <w:rPr>
@@ -3552,63 +3546,213 @@
           <w:color w:val="000000"/>
           <w:sz w:val="20"/>
           <w:szCs w:val="20"/>
-          <w:lang w:val="en-US"/>
-        </w:rPr>
-      </w:pPr>
-      <w:r>
-        <w:rPr>
-          <w:rFonts w:ascii="Consolas" w:hAnsi="Consolas"/>
-          <w:color w:val="000000"/>
-          <w:sz w:val="20"/>
-          <w:szCs w:val="20"/>
-          <w:lang w:val="en-US"/>
-        </w:rPr>
-        <w:t xml:space="preserve">          | I2C_CR2_RD_WRN</w:t>
-      </w:r>
-    </w:p>
-    <w:p>
-      <w:pPr>
-        <w:pStyle w:val="ad"/>
-        <w:shd w:val="clear" w:color="auto" w:fill="FFFFFF"/>
-        <w:spacing w:before="0" w:beforeAutospacing="0" w:after="0" w:afterAutospacing="0"/>
-        <w:rPr>
-          <w:rFonts w:ascii="Consolas" w:hAnsi="Consolas"/>
-          <w:color w:val="000000"/>
-          <w:sz w:val="20"/>
-          <w:szCs w:val="20"/>
-          <w:lang w:val="en-US"/>
-        </w:rPr>
-      </w:pPr>
-      <w:r>
-        <w:rPr>
-          <w:rFonts w:ascii="Consolas" w:hAnsi="Consolas"/>
-          <w:color w:val="000000"/>
-          <w:sz w:val="20"/>
-          <w:szCs w:val="20"/>
-          <w:lang w:val="en-US"/>
-        </w:rPr>
-        <w:t xml:space="preserve">          | I2C_CR2_</w:t>
-      </w:r>
-      <w:proofErr w:type="gramStart"/>
-      <w:r>
-        <w:rPr>
-          <w:rFonts w:ascii="Consolas" w:hAnsi="Consolas"/>
-          <w:color w:val="000000"/>
-          <w:sz w:val="20"/>
-          <w:szCs w:val="20"/>
-          <w:lang w:val="en-US"/>
-        </w:rPr>
-        <w:t>AUTOEND;</w:t>
-      </w:r>
-      <w:proofErr w:type="gramEnd"/>
-    </w:p>
-    <w:p>
-      <w:pPr>
-        <w:rPr>
-          <w:lang w:val="en-US"/>
-        </w:rPr>
-      </w:pPr>
-    </w:p>
+        </w:rPr>
+      </w:pPr>
+      <w:r>
+        <w:rPr>
+          <w:rFonts w:ascii="Consolas" w:hAnsi="Consolas"/>
+          <w:color w:val="000000"/>
+          <w:sz w:val="20"/>
+          <w:szCs w:val="20"/>
+          <w:lang w:val="en-US"/>
+        </w:rPr>
+        <w:t xml:space="preserve">          </w:t>
+      </w:r>
+      <w:r>
+        <w:rPr>
+          <w:rFonts w:ascii="Consolas" w:hAnsi="Consolas"/>
+          <w:color w:val="000000"/>
+          <w:sz w:val="20"/>
+          <w:szCs w:val="20"/>
+        </w:rPr>
+        <w:t xml:space="preserve">| </w:t>
+      </w:r>
+      <w:r>
+        <w:rPr>
+          <w:rFonts w:ascii="Consolas" w:hAnsi="Consolas"/>
+          <w:color w:val="000000"/>
+          <w:sz w:val="20"/>
+          <w:szCs w:val="20"/>
+          <w:lang w:val="en-US"/>
+        </w:rPr>
+        <w:t>I</w:t>
+      </w:r>
+      <w:r>
+        <w:rPr>
+          <w:rFonts w:ascii="Consolas" w:hAnsi="Consolas"/>
+          <w:color w:val="000000"/>
+          <w:sz w:val="20"/>
+          <w:szCs w:val="20"/>
+        </w:rPr>
+        <w:t>2</w:t>
+      </w:r>
+      <w:r>
+        <w:rPr>
+          <w:rFonts w:ascii="Consolas" w:hAnsi="Consolas"/>
+          <w:color w:val="000000"/>
+          <w:sz w:val="20"/>
+          <w:szCs w:val="20"/>
+          <w:lang w:val="en-US"/>
+        </w:rPr>
+        <w:t>C</w:t>
+      </w:r>
+      <w:r>
+        <w:rPr>
+          <w:rFonts w:ascii="Consolas" w:hAnsi="Consolas"/>
+          <w:color w:val="000000"/>
+          <w:sz w:val="20"/>
+          <w:szCs w:val="20"/>
+        </w:rPr>
+        <w:t>_</w:t>
+      </w:r>
+      <w:r>
+        <w:rPr>
+          <w:rFonts w:ascii="Consolas" w:hAnsi="Consolas"/>
+          <w:color w:val="000000"/>
+          <w:sz w:val="20"/>
+          <w:szCs w:val="20"/>
+          <w:lang w:val="en-US"/>
+        </w:rPr>
+        <w:t>CR</w:t>
+      </w:r>
+      <w:r>
+        <w:rPr>
+          <w:rFonts w:ascii="Consolas" w:hAnsi="Consolas"/>
+          <w:color w:val="000000"/>
+          <w:sz w:val="20"/>
+          <w:szCs w:val="20"/>
+        </w:rPr>
+        <w:t>2_</w:t>
+      </w:r>
+      <w:r>
+        <w:rPr>
+          <w:rFonts w:ascii="Consolas" w:hAnsi="Consolas"/>
+          <w:color w:val="000000"/>
+          <w:sz w:val="20"/>
+          <w:szCs w:val="20"/>
+          <w:lang w:val="en-US"/>
+        </w:rPr>
+        <w:t>RD</w:t>
+      </w:r>
+      <w:r>
+        <w:rPr>
+          <w:rFonts w:ascii="Consolas" w:hAnsi="Consolas"/>
+          <w:color w:val="000000"/>
+          <w:sz w:val="20"/>
+          <w:szCs w:val="20"/>
+        </w:rPr>
+        <w:t>_</w:t>
+      </w:r>
+      <w:r>
+        <w:rPr>
+          <w:rFonts w:ascii="Consolas" w:hAnsi="Consolas"/>
+          <w:color w:val="000000"/>
+          <w:sz w:val="20"/>
+          <w:szCs w:val="20"/>
+          <w:lang w:val="en-US"/>
+        </w:rPr>
+        <w:t>WRN</w:t>
+      </w:r>
+    </w:p>
+    <w:p>
+      <w:pPr>
+        <w:pStyle w:val="ad"/>
+        <w:shd w:val="clear" w:color="auto" w:fill="FFFFFF"/>
+        <w:spacing w:before="0" w:beforeAutospacing="0" w:after="0" w:afterAutospacing="0"/>
+        <w:rPr>
+          <w:rFonts w:ascii="Consolas" w:hAnsi="Consolas"/>
+          <w:color w:val="000000"/>
+          <w:sz w:val="20"/>
+          <w:szCs w:val="20"/>
+        </w:rPr>
+      </w:pPr>
+      <w:r>
+        <w:rPr>
+          <w:rFonts w:ascii="Consolas" w:hAnsi="Consolas"/>
+          <w:color w:val="000000"/>
+          <w:sz w:val="20"/>
+          <w:szCs w:val="20"/>
+        </w:rPr>
+        <w:t xml:space="preserve">          | </w:t>
+      </w:r>
+      <w:r>
+        <w:rPr>
+          <w:rFonts w:ascii="Consolas" w:hAnsi="Consolas"/>
+          <w:color w:val="000000"/>
+          <w:sz w:val="20"/>
+          <w:szCs w:val="20"/>
+          <w:lang w:val="en-US"/>
+        </w:rPr>
+        <w:t>I</w:t>
+      </w:r>
+      <w:r>
+        <w:rPr>
+          <w:rFonts w:ascii="Consolas" w:hAnsi="Consolas"/>
+          <w:color w:val="000000"/>
+          <w:sz w:val="20"/>
+          <w:szCs w:val="20"/>
+        </w:rPr>
+        <w:t>2</w:t>
+      </w:r>
+      <w:r>
+        <w:rPr>
+          <w:rFonts w:ascii="Consolas" w:hAnsi="Consolas"/>
+          <w:color w:val="000000"/>
+          <w:sz w:val="20"/>
+          <w:szCs w:val="20"/>
+          <w:lang w:val="en-US"/>
+        </w:rPr>
+        <w:t>C</w:t>
+      </w:r>
+      <w:r>
+        <w:rPr>
+          <w:rFonts w:ascii="Consolas" w:hAnsi="Consolas"/>
+          <w:color w:val="000000"/>
+          <w:sz w:val="20"/>
+          <w:szCs w:val="20"/>
+        </w:rPr>
+        <w:t>_</w:t>
+      </w:r>
+      <w:r>
+        <w:rPr>
+          <w:rFonts w:ascii="Consolas" w:hAnsi="Consolas"/>
+          <w:color w:val="000000"/>
+          <w:sz w:val="20"/>
+          <w:szCs w:val="20"/>
+          <w:lang w:val="en-US"/>
+        </w:rPr>
+        <w:t>CR</w:t>
+      </w:r>
+      <w:r>
+        <w:rPr>
+          <w:rFonts w:ascii="Consolas" w:hAnsi="Consolas"/>
+          <w:color w:val="000000"/>
+          <w:sz w:val="20"/>
+          <w:szCs w:val="20"/>
+        </w:rPr>
+        <w:t>2_</w:t>
+      </w:r>
+      <w:r>
+        <w:rPr>
+          <w:rFonts w:ascii="Consolas" w:hAnsi="Consolas"/>
+          <w:color w:val="000000"/>
+          <w:sz w:val="20"/>
+          <w:szCs w:val="20"/>
+          <w:lang w:val="en-US"/>
+        </w:rPr>
+        <w:t>AUTOEND</w:t>
+      </w:r>
+      <w:r>
+        <w:rPr>
+          <w:rFonts w:ascii="Consolas" w:hAnsi="Consolas"/>
+          <w:color w:val="000000"/>
+          <w:sz w:val="20"/>
+          <w:szCs w:val="20"/>
+        </w:rPr>
+        <w:t>;</w:t>
+      </w:r>
+    </w:p>
+    <w:p/>
     <w:p>
       <w:r>
         <w:t xml:space="preserve">И затем сделать чтение и запись в буфер в цикле: </w:t>
@@ -7335,6 +7479,7 @@
           <w:color w:val="000000"/>
           <w:sz w:val="20"/>
           <w:szCs w:val="20"/>
+          <w:lang w:val="en-US"/>
         </w:rPr>
       </w:pPr>
       <w:r>
@@ -7364,6 +7509,7 @@
           <w:color w:val="000000"/>
           <w:sz w:val="20"/>
           <w:szCs w:val="20"/>
+          <w:lang w:val="en-US"/>
         </w:rPr>
         <w:t xml:space="preserve"> </w:t>
       </w:r>
@@ -7387,6 +7533,7 @@
           <w:color w:val="000000"/>
           <w:sz w:val="20"/>
           <w:szCs w:val="20"/>
+          <w:lang w:val="en-US"/>
         </w:rPr>
         <w:t>2</w:t>
       </w:r>
@@ -7410,10 +7557,10 @@
           <w:color w:val="000000"/>
           <w:sz w:val="20"/>
           <w:szCs w:val="20"/>
+          <w:lang w:val="en-US"/>
         </w:rPr>
         <w:t>_</w:t>
       </w:r>
-      <w:proofErr w:type="spellStart"/>
       <w:proofErr w:type="gramStart"/>
       <w:r>
         <w:rPr>
@@ -7427,6 +7574,68 @@
         </w:rPr>
         <w:t>WriteReg</w:t>
       </w:r>
+      <w:r>
+        <w:rPr>
+          <w:rFonts w:ascii="Consolas" w:hAnsi="Consolas"/>
+          <w:color w:val="000000"/>
+          <w:sz w:val="20"/>
+          <w:szCs w:val="20"/>
+          <w:lang w:val="en-US"/>
+        </w:rPr>
+        <w:t>(</w:t>
+      </w:r>
+      <w:proofErr w:type="gramEnd"/>
+      <w:r>
+        <w:rPr>
+          <w:rFonts w:ascii="Consolas" w:hAnsi="Consolas"/>
+          <w:color w:val="005032"/>
+          <w:sz w:val="20"/>
+          <w:szCs w:val="20"/>
+          <w:lang w:val="en-US"/>
+        </w:rPr>
+        <w:t>uint</w:t>
+      </w:r>
+      <w:r>
+        <w:rPr>
+          <w:rFonts w:ascii="Consolas" w:hAnsi="Consolas"/>
+          <w:color w:val="005032"/>
+          <w:sz w:val="20"/>
+          <w:szCs w:val="20"/>
+          <w:lang w:val="en-US"/>
+        </w:rPr>
+        <w:t>8_</w:t>
+      </w:r>
+      <w:r>
+        <w:rPr>
+          <w:rFonts w:ascii="Consolas" w:hAnsi="Consolas"/>
+          <w:color w:val="005032"/>
+          <w:sz w:val="20"/>
+          <w:szCs w:val="20"/>
+          <w:lang w:val="en-US"/>
+        </w:rPr>
+        <w:t>t</w:t>
+      </w:r>
+      <w:r>
+        <w:rPr>
+          <w:rFonts w:ascii="Consolas" w:hAnsi="Consolas"/>
+          <w:color w:val="000000"/>
+          <w:sz w:val="20"/>
+          <w:szCs w:val="20"/>
+          <w:lang w:val="en-US"/>
+        </w:rPr>
+        <w:t xml:space="preserve"> </w:t>
+      </w:r>
+      <w:proofErr w:type="spellStart"/>
+      <w:r>
+        <w:rPr>
+          <w:rFonts w:ascii="Consolas" w:hAnsi="Consolas"/>
+          <w:color w:val="000000"/>
+          <w:sz w:val="20"/>
+          <w:szCs w:val="20"/>
+          <w:lang w:val="en-US"/>
+        </w:rPr>
+        <w:t>addr</w:t>
+      </w:r>
       <w:proofErr w:type="spellEnd"/>
       <w:r>
         <w:rPr>
@@ -7434,11 +7643,10 @@
           <w:color w:val="000000"/>
           <w:sz w:val="20"/>
           <w:szCs w:val="20"/>
-        </w:rPr>
-        <w:t>(</w:t>
-      </w:r>
-      <w:proofErr w:type="spellStart"/>
-      <w:proofErr w:type="gramEnd"/>
+          <w:lang w:val="en-US"/>
+        </w:rPr>
+        <w:t xml:space="preserve">, </w:t>
+      </w:r>
       <w:r>
         <w:rPr>
           <w:rFonts w:ascii="Consolas" w:hAnsi="Consolas"/>
@@ -7449,13 +7657,13 @@
         </w:rPr>
         <w:t>uint</w:t>
       </w:r>
-      <w:proofErr w:type="spellEnd"/>
       <w:r>
         <w:rPr>
           <w:rFonts w:ascii="Consolas" w:hAnsi="Consolas"/>
           <w:color w:val="005032"/>
           <w:sz w:val="20"/>
           <w:szCs w:val="20"/>
+          <w:lang w:val="en-US"/>
         </w:rPr>
         <w:t>8_</w:t>
       </w:r>
@@ -7475,31 +7683,30 @@
           <w:color w:val="000000"/>
           <w:sz w:val="20"/>
           <w:szCs w:val="20"/>
+          <w:lang w:val="en-US"/>
         </w:rPr>
         <w:t xml:space="preserve"> </w:t>
       </w:r>
-      <w:proofErr w:type="spellStart"/>
-      <w:r>
-        <w:rPr>
-          <w:rFonts w:ascii="Consolas" w:hAnsi="Consolas"/>
-          <w:color w:val="000000"/>
-          <w:sz w:val="20"/>
-          <w:szCs w:val="20"/>
-          <w:lang w:val="en-US"/>
-        </w:rPr>
-        <w:t>addr</w:t>
-      </w:r>
-      <w:proofErr w:type="spellEnd"/>
-      <w:r>
-        <w:rPr>
-          <w:rFonts w:ascii="Consolas" w:hAnsi="Consolas"/>
-          <w:color w:val="000000"/>
-          <w:sz w:val="20"/>
-          <w:szCs w:val="20"/>
+      <w:r>
+        <w:rPr>
+          <w:rFonts w:ascii="Consolas" w:hAnsi="Consolas"/>
+          <w:color w:val="000000"/>
+          <w:sz w:val="20"/>
+          <w:szCs w:val="20"/>
+          <w:lang w:val="en-US"/>
+        </w:rPr>
+        <w:t>reg</w:t>
+      </w:r>
+      <w:r>
+        <w:rPr>
+          <w:rFonts w:ascii="Consolas" w:hAnsi="Consolas"/>
+          <w:color w:val="000000"/>
+          <w:sz w:val="20"/>
+          <w:szCs w:val="20"/>
+          <w:lang w:val="en-US"/>
         </w:rPr>
         <w:t xml:space="preserve">, </w:t>
       </w:r>
-      <w:proofErr w:type="spellStart"/>
       <w:r>
         <w:rPr>
           <w:rFonts w:ascii="Consolas" w:hAnsi="Consolas"/>
@@ -7510,13 +7717,13 @@
         </w:rPr>
         <w:t>uint</w:t>
       </w:r>
-      <w:proofErr w:type="spellEnd"/>
       <w:r>
         <w:rPr>
           <w:rFonts w:ascii="Consolas" w:hAnsi="Consolas"/>
           <w:color w:val="005032"/>
           <w:sz w:val="20"/>
           <w:szCs w:val="20"/>
+          <w:lang w:val="en-US"/>
         </w:rPr>
         <w:t>8_</w:t>
       </w:r>
@@ -7536,6 +7743,7 @@
           <w:color w:val="000000"/>
           <w:sz w:val="20"/>
           <w:szCs w:val="20"/>
+          <w:lang w:val="en-US"/>
         </w:rPr>
         <w:t xml:space="preserve"> </w:t>
       </w:r>
@@ -7547,65 +7755,6 @@
           <w:szCs w:val="20"/>
           <w:lang w:val="en-US"/>
         </w:rPr>
-        <w:t>reg</w:t>
-      </w:r>
-      <w:r>
-        <w:rPr>
-          <w:rFonts w:ascii="Consolas" w:hAnsi="Consolas"/>
-          <w:color w:val="000000"/>
-          <w:sz w:val="20"/>
-          <w:szCs w:val="20"/>
-        </w:rPr>
-        <w:t xml:space="preserve">, </w:t>
-      </w:r>
-      <w:proofErr w:type="spellStart"/>
-      <w:r>
-        <w:rPr>
-          <w:rFonts w:ascii="Consolas" w:hAnsi="Consolas"/>
-          <w:color w:val="005032"/>
-          <w:sz w:val="20"/>
-          <w:szCs w:val="20"/>
-          <w:lang w:val="en-US"/>
-        </w:rPr>
-        <w:t>uint</w:t>
-      </w:r>
-      <w:proofErr w:type="spellEnd"/>
-      <w:r>
-        <w:rPr>
-          <w:rFonts w:ascii="Consolas" w:hAnsi="Consolas"/>
-          <w:color w:val="005032"/>
-          <w:sz w:val="20"/>
-          <w:szCs w:val="20"/>
-        </w:rPr>
-        <w:t>8_</w:t>
-      </w:r>
-      <w:r>
-        <w:rPr>
-          <w:rFonts w:ascii="Consolas" w:hAnsi="Consolas"/>
-          <w:color w:val="005032"/>
-          <w:sz w:val="20"/>
-          <w:szCs w:val="20"/>
-          <w:lang w:val="en-US"/>
-        </w:rPr>
-        <w:t>t</w:t>
-      </w:r>
-      <w:r>
-        <w:rPr>
-          <w:rFonts w:ascii="Consolas" w:hAnsi="Consolas"/>
-          <w:color w:val="000000"/>
-          <w:sz w:val="20"/>
-          <w:szCs w:val="20"/>
-        </w:rPr>
-        <w:t xml:space="preserve"> </w:t>
-      </w:r>
-      <w:r>
-        <w:rPr>
-          <w:rFonts w:ascii="Consolas" w:hAnsi="Consolas"/>
-          <w:color w:val="000000"/>
-          <w:sz w:val="20"/>
-          <w:szCs w:val="20"/>
-          <w:lang w:val="en-US"/>
-        </w:rPr>
         <w:t>data</w:t>
       </w:r>
       <w:r>
@@ -7614,6 +7763,7 @@
           <w:color w:val="000000"/>
           <w:sz w:val="20"/>
           <w:szCs w:val="20"/>
+          <w:lang w:val="en-US"/>
         </w:rPr>
         <w:t>)</w:t>
       </w:r>
@@ -7637,6 +7787,7 @@
           <w:color w:val="000000"/>
           <w:sz w:val="20"/>
           <w:szCs w:val="20"/>
+          <w:lang w:val="en-US"/>
         </w:rPr>
         <w:t xml:space="preserve">  </w:t>
       </w:r>
@@ -12099,9 +12250,494 @@
     <w:p>
       <w:pPr>
         <w:pStyle w:val="1"/>
-        <w:rPr>
-          <w:lang w:val="en-US"/>
-        </w:rPr>
+      </w:pPr>
+      <w:r>
+        <w:lastRenderedPageBreak/>
+        <w:t xml:space="preserve">Когда появляется </w:t>
+      </w:r>
+      <w:r>
+        <w:rPr>
+          <w:lang w:val="en-US"/>
+        </w:rPr>
+        <w:t>TXIS</w:t>
+      </w:r>
+    </w:p>
+    <w:p>
+      <w:pPr>
+        <w:rPr>
+          <w:lang w:val="en-US"/>
+        </w:rPr>
+      </w:pPr>
+    </w:p>
+    <w:p>
+      <w:r>
+        <w:t xml:space="preserve">Бит выставляется </w:t>
+      </w:r>
+      <w:proofErr w:type="spellStart"/>
+      <w:proofErr w:type="gramStart"/>
+      <w:r>
+        <w:t>аппаратно</w:t>
+      </w:r>
+      <w:proofErr w:type="spellEnd"/>
+      <w:proofErr w:type="gramEnd"/>
+      <w:r>
+        <w:t xml:space="preserve"> когда </w:t>
+      </w:r>
+      <w:r>
+        <w:rPr>
+          <w:lang w:val="en-US"/>
+        </w:rPr>
+        <w:t>I</w:t>
+      </w:r>
+      <w:r>
+        <w:t>2</w:t>
+      </w:r>
+      <w:r>
+        <w:rPr>
+          <w:lang w:val="en-US"/>
+        </w:rPr>
+        <w:t>C</w:t>
+      </w:r>
+      <w:r>
+        <w:t>_</w:t>
+      </w:r>
+      <w:r>
+        <w:rPr>
+          <w:lang w:val="en-US"/>
+        </w:rPr>
+        <w:t>TXDR</w:t>
+      </w:r>
+      <w:r>
+        <w:t xml:space="preserve"> </w:t>
+      </w:r>
+      <w:r>
+        <w:t xml:space="preserve">регистр пуст данные могут быть записаны в него. Сбрасывается, когда в </w:t>
+      </w:r>
+      <w:r>
+        <w:rPr>
+          <w:lang w:val="en-US"/>
+        </w:rPr>
+        <w:t>I</w:t>
+      </w:r>
+      <w:r>
+        <w:t>2</w:t>
+      </w:r>
+      <w:r>
+        <w:rPr>
+          <w:lang w:val="en-US"/>
+        </w:rPr>
+        <w:t>C</w:t>
+      </w:r>
+      <w:r>
+        <w:t>_</w:t>
+      </w:r>
+      <w:r>
+        <w:rPr>
+          <w:lang w:val="en-US"/>
+        </w:rPr>
+        <w:t>TXDR</w:t>
+      </w:r>
+      <w:r>
+        <w:t xml:space="preserve"> записываются новые данные. То есть после того</w:t>
+      </w:r>
+      <w:r>
+        <w:t xml:space="preserve">, </w:t>
+      </w:r>
+      <w:r>
+        <w:t xml:space="preserve">как ведомое устройство ответило </w:t>
+      </w:r>
+      <w:r>
+        <w:rPr>
+          <w:lang w:val="en-US"/>
+        </w:rPr>
+        <w:t>ACK</w:t>
+      </w:r>
+      <w:r>
+        <w:t xml:space="preserve">, </w:t>
+      </w:r>
+      <w:r>
+        <w:t xml:space="preserve">в регистре </w:t>
+      </w:r>
+      <w:r>
+        <w:rPr>
+          <w:lang w:val="en-US"/>
+        </w:rPr>
+        <w:t>ISR</w:t>
+      </w:r>
+      <w:r>
+        <w:t xml:space="preserve"> </w:t>
+      </w:r>
+      <w:r>
+        <w:t xml:space="preserve">появиться флаг </w:t>
+      </w:r>
+      <w:r>
+        <w:t>I2C_ISR_TXIS</w:t>
+      </w:r>
+      <w:r>
+        <w:t>. Это значит, что передатчик пуст. Можно загружать следующий байт.</w:t>
+      </w:r>
+      <w:r>
+        <w:t xml:space="preserve"> </w:t>
+      </w:r>
+    </w:p>
+    <w:p>
+      <w:r>
+        <w:t>TXIS</w:t>
+      </w:r>
+      <w:r>
+        <w:t xml:space="preserve"> – </w:t>
+      </w:r>
+      <w:proofErr w:type="spellStart"/>
+      <w:r>
+        <w:t>Transmit</w:t>
+      </w:r>
+      <w:proofErr w:type="spellEnd"/>
+      <w:r>
+        <w:t xml:space="preserve"> </w:t>
+      </w:r>
+      <w:proofErr w:type="spellStart"/>
+      <w:r>
+        <w:t>interrupt</w:t>
+      </w:r>
+      <w:proofErr w:type="spellEnd"/>
+      <w:r>
+        <w:t xml:space="preserve"> </w:t>
+      </w:r>
+      <w:proofErr w:type="spellStart"/>
+      <w:r>
+        <w:t>status</w:t>
+      </w:r>
+      <w:proofErr w:type="spellEnd"/>
+      <w:r>
+        <w:t>.</w:t>
+      </w:r>
+    </w:p>
+    <w:p/>
+    <w:p>
+      <w:pPr>
+        <w:pStyle w:val="1"/>
+        <w:rPr>
+          <w:lang w:val="en-US"/>
+        </w:rPr>
+      </w:pPr>
+      <w:r>
+        <w:t xml:space="preserve">Что происходит после записи в </w:t>
+      </w:r>
+      <w:r>
+        <w:rPr>
+          <w:lang w:val="en-US"/>
+        </w:rPr>
+        <w:t>TXDR</w:t>
+      </w:r>
+      <w:r>
+        <w:t xml:space="preserve"> </w:t>
+      </w:r>
+    </w:p>
+    <w:p/>
+    <w:p>
+      <w:r>
+        <w:t xml:space="preserve">Байт попадает во внутренний сдвиговый регистр периферии. Дальше </w:t>
+      </w:r>
+      <w:r>
+        <w:rPr>
+          <w:lang w:val="en-US"/>
+        </w:rPr>
+        <w:t>I</w:t>
+      </w:r>
+      <w:r>
+        <w:t>2</w:t>
+      </w:r>
+      <w:r>
+        <w:rPr>
+          <w:lang w:val="en-US"/>
+        </w:rPr>
+        <w:t>C</w:t>
+      </w:r>
+      <w:r>
+        <w:t xml:space="preserve"> </w:t>
+      </w:r>
+      <w:r>
+        <w:t xml:space="preserve">сам выводит его на </w:t>
+      </w:r>
+      <w:r>
+        <w:rPr>
+          <w:lang w:val="en-US"/>
+        </w:rPr>
+        <w:t>SDA</w:t>
+      </w:r>
+      <w:r>
+        <w:t xml:space="preserve">. </w:t>
+      </w:r>
+      <w:r>
+        <w:rPr>
+          <w:lang w:val="en-US"/>
+        </w:rPr>
+        <w:t xml:space="preserve">CPU </w:t>
+      </w:r>
+      <w:r>
+        <w:t>больше ничего не делает.</w:t>
+      </w:r>
+    </w:p>
+    <w:p>
+      <w:pPr>
+        <w:ind w:firstLine="0"/>
+      </w:pPr>
+    </w:p>
+    <w:p>
+      <w:pPr>
+        <w:pStyle w:val="1"/>
+        <w:rPr>
+          <w:lang w:val="en-US"/>
+        </w:rPr>
+      </w:pPr>
+      <w:r>
+        <w:t xml:space="preserve">Флаг </w:t>
+      </w:r>
+      <w:r>
+        <w:rPr>
+          <w:lang w:val="en-US"/>
+        </w:rPr>
+        <w:t xml:space="preserve">I2C_ISR_TC </w:t>
+      </w:r>
+    </w:p>
+    <w:p>
+      <w:pPr>
+        <w:rPr>
+          <w:lang w:val="en-US"/>
+        </w:rPr>
+      </w:pPr>
+    </w:p>
+    <w:p>
+      <w:r>
+        <w:t>Означает конец передачи (</w:t>
+      </w:r>
+      <w:r>
+        <w:rPr>
+          <w:lang w:val="en-US"/>
+        </w:rPr>
+        <w:t>transfer</w:t>
+      </w:r>
+      <w:r>
+        <w:t xml:space="preserve"> </w:t>
+      </w:r>
+      <w:r>
+        <w:rPr>
+          <w:lang w:val="en-US"/>
+        </w:rPr>
+        <w:t>complete</w:t>
+      </w:r>
+      <w:r>
+        <w:t>)</w:t>
+      </w:r>
+      <w:r>
+        <w:t xml:space="preserve">. </w:t>
+      </w:r>
+      <w:r>
+        <w:t xml:space="preserve">То есть все </w:t>
+      </w:r>
+      <w:r>
+        <w:rPr>
+          <w:lang w:val="en-US"/>
+        </w:rPr>
+        <w:t>NBYTES</w:t>
+      </w:r>
+      <w:r>
+        <w:t xml:space="preserve"> </w:t>
+      </w:r>
+      <w:r>
+        <w:t xml:space="preserve">переданы. </w:t>
+      </w:r>
+      <w:r>
+        <w:rPr>
+          <w:lang w:val="en-US"/>
+        </w:rPr>
+        <w:t>AUTOEND</w:t>
+      </w:r>
+      <w:r>
+        <w:t xml:space="preserve"> </w:t>
+      </w:r>
+      <w:r>
+        <w:t>выключен</w:t>
+      </w:r>
+      <w:r>
+        <w:t xml:space="preserve">. </w:t>
+      </w:r>
+      <w:r>
+        <w:rPr>
+          <w:lang w:val="en-US"/>
+        </w:rPr>
+        <w:t>STOP</w:t>
+      </w:r>
+      <w:r>
+        <w:t xml:space="preserve"> </w:t>
+      </w:r>
+      <w:r>
+        <w:t xml:space="preserve">не сформирован. Теперь можно дать </w:t>
+      </w:r>
+      <w:r>
+        <w:rPr>
+          <w:lang w:val="en-US"/>
+        </w:rPr>
+        <w:t>RESTART</w:t>
+      </w:r>
+      <w:r>
+        <w:t xml:space="preserve">, </w:t>
+      </w:r>
+      <w:r>
+        <w:rPr>
+          <w:lang w:val="en-US"/>
+        </w:rPr>
+        <w:t xml:space="preserve">STOP, </w:t>
+      </w:r>
+      <w:r>
+        <w:t>изменить направление передачи.</w:t>
+      </w:r>
+    </w:p>
+    <w:p/>
+    <w:p>
+      <w:pPr>
+        <w:pStyle w:val="1"/>
+        <w:rPr>
+          <w:lang w:val="en-US"/>
+        </w:rPr>
+      </w:pPr>
+      <w:r>
+        <w:t xml:space="preserve">Как появляется </w:t>
+      </w:r>
+      <w:r>
+        <w:rPr>
+          <w:lang w:val="en-US"/>
+        </w:rPr>
+        <w:t>RXNE</w:t>
+      </w:r>
+    </w:p>
+    <w:p>
+      <w:pPr>
+        <w:rPr>
+          <w:lang w:val="en-US"/>
+        </w:rPr>
+      </w:pPr>
+    </w:p>
+    <w:p>
+      <w:proofErr w:type="gramStart"/>
+      <w:r>
+        <w:t>После получения байта от ведомого,</w:t>
+      </w:r>
+      <w:proofErr w:type="gramEnd"/>
+      <w:r>
+        <w:t xml:space="preserve"> данные помещаются в </w:t>
+      </w:r>
+      <w:r>
+        <w:t>I2C_RXDR</w:t>
+      </w:r>
+      <w:r>
+        <w:t xml:space="preserve"> </w:t>
+      </w:r>
+      <w:r>
+        <w:t xml:space="preserve">и выставляется бит </w:t>
+      </w:r>
+      <w:r>
+        <w:rPr>
+          <w:lang w:val="en-US"/>
+        </w:rPr>
+        <w:t>RXNE</w:t>
+      </w:r>
+      <w:r>
+        <w:t xml:space="preserve"> </w:t>
+      </w:r>
+      <w:r>
+        <w:t xml:space="preserve">регистра </w:t>
+      </w:r>
+      <w:r>
+        <w:rPr>
+          <w:lang w:val="en-US"/>
+        </w:rPr>
+        <w:t>I</w:t>
+      </w:r>
+      <w:r>
+        <w:t>2</w:t>
+      </w:r>
+      <w:r>
+        <w:rPr>
+          <w:lang w:val="en-US"/>
+        </w:rPr>
+        <w:t>C</w:t>
+      </w:r>
+      <w:r>
+        <w:t>_</w:t>
+      </w:r>
+      <w:r>
+        <w:rPr>
+          <w:lang w:val="en-US"/>
+        </w:rPr>
+        <w:t>ISR</w:t>
+      </w:r>
+      <w:r>
+        <w:t xml:space="preserve"> </w:t>
+      </w:r>
+      <w:r>
+        <w:t>–</w:t>
+      </w:r>
+      <w:r>
+        <w:t xml:space="preserve"> </w:t>
+      </w:r>
+      <w:proofErr w:type="spellStart"/>
+      <w:r>
+        <w:t>Receive</w:t>
+      </w:r>
+      <w:proofErr w:type="spellEnd"/>
+      <w:r>
+        <w:t xml:space="preserve"> Data </w:t>
+      </w:r>
+      <w:proofErr w:type="spellStart"/>
+      <w:r>
+        <w:t>Register</w:t>
+      </w:r>
+      <w:proofErr w:type="spellEnd"/>
+      <w:r>
+        <w:t xml:space="preserve"> </w:t>
+      </w:r>
+      <w:proofErr w:type="spellStart"/>
+      <w:r>
+        <w:t>Not</w:t>
+      </w:r>
+      <w:proofErr w:type="spellEnd"/>
+      <w:r>
+        <w:t xml:space="preserve"> </w:t>
+      </w:r>
+      <w:proofErr w:type="spellStart"/>
+      <w:r>
+        <w:t>Empty</w:t>
+      </w:r>
+      <w:proofErr w:type="spellEnd"/>
+      <w:r>
+        <w:t xml:space="preserve">. </w:t>
+      </w:r>
+      <w:r>
+        <w:t xml:space="preserve">То есть </w:t>
+      </w:r>
+      <w:r>
+        <w:t>RXDR содержит непрочитанный байт</w:t>
+      </w:r>
+      <w:r>
+        <w:t>.</w:t>
+      </w:r>
+    </w:p>
+    <w:p/>
+    <w:p/>
+    <w:p>
+      <w:pPr>
+        <w:sectPr>
+          <w:pgSz w:w="11906" w:h="16838" w:code="9"/>
+          <w:pgMar w:top="1134" w:right="851" w:bottom="1134" w:left="1701" w:header="709" w:footer="709" w:gutter="0"/>
+          <w:cols w:space="708"/>
+          <w:docGrid w:linePitch="381"/>
+        </w:sectPr>
+      </w:pPr>
+    </w:p>
+    <w:p>
+      <w:pPr>
+        <w:pStyle w:val="1"/>
       </w:pPr>
       <w:r>
         <w:lastRenderedPageBreak/>
@@ -12111,16 +12747,19 @@
         <w:rPr>
           <w:lang w:val="en-US"/>
         </w:rPr>
-        <w:t>I2C</w:t>
-      </w:r>
-    </w:p>
-    <w:p>
-      <w:pPr>
-        <w:rPr>
-          <w:lang w:val="en-US"/>
-        </w:rPr>
-      </w:pPr>
-    </w:p>
+        <w:t>I</w:t>
+      </w:r>
+      <w:r>
+        <w:t>2</w:t>
+      </w:r>
+      <w:r>
+        <w:rPr>
+          <w:lang w:val="en-US"/>
+        </w:rPr>
+        <w:t>C</w:t>
+      </w:r>
+    </w:p>
+    <w:p/>
     <w:p>
       <w:r>
         <w:t>Разобрать:</w:t>
@@ -13256,7 +13895,6 @@
   <w:style w:type="character" w:default="1" w:styleId="a0">
     <w:name w:val="Default Paragraph Font"/>
     <w:uiPriority w:val="1"/>
-    <w:semiHidden/>
     <w:unhideWhenUsed/>
   </w:style>
   <w:style w:type="table" w:default="1" w:styleId="a1">
@@ -13917,4 +14555,16 @@
     </a:ext>
   </a:extLst>
 </a:theme>
+</file>
+
+<file path=customXml/item1.xml><?xml version="1.0" encoding="utf-8"?>
+<b:Sources xmlns:b="http://schemas.openxmlformats.org/officeDocument/2006/bibliography" xmlns="http://schemas.openxmlformats.org/officeDocument/2006/bibliography" SelectedStyle="\APASixthEditionOfficeOnline.xsl" StyleName="APA" Version="6"/>
+</file>
+
+<file path=customXml/itemProps1.xml><?xml version="1.0" encoding="utf-8"?>
+<ds:datastoreItem xmlns:ds="http://schemas.openxmlformats.org/officeDocument/2006/customXml" ds:itemID="{7713252F-C34F-454A-8A5E-FFE44373F8F0}">
+  <ds:schemaRefs>
+    <ds:schemaRef ds:uri="http://schemas.openxmlformats.org/officeDocument/2006/bibliography"/>
+  </ds:schemaRefs>
+</ds:datastoreItem>
 </file>
</xml_diff>